<commit_message>
docs: include vector flow architecture block diagram in system docx
</commit_message>
<xml_diff>
--- a/Bizionary_ERP_Desktop_System_Documentation.docx
+++ b/Bizionary_ERP_Desktop_System_Documentation.docx
@@ -66,7 +66,76 @@
           <w:color w:val="2B2620"/>
           <w:sz w:val="32"/>
         </w:rPr>
-        <w:t>2. Technical Stack Overview</w:t>
+        <w:t>2. System Architecture Diagram</w:t>
+      </w:r>
+    </w:p>
+    <w:p>
+      <w:r>
+        <w:t>The diagram below outlines the flow of control and data between the click-to-run launchers, the local backend web server, the local web browser interface, and the packaged database and files inside the shopkeeper's PC:</w:t>
+      </w:r>
+    </w:p>
+    <w:p>
+      <w:r>
+        <w:drawing>
+          <wp:inline xmlns:a="http://schemas.openxmlformats.org/drawingml/2006/main" xmlns:pic="http://schemas.openxmlformats.org/drawingml/2006/picture">
+            <wp:extent cx="5486400" cy="2743200"/>
+            <wp:docPr id="1" name="Picture 1"/>
+            <wp:cNvGraphicFramePr>
+              <a:graphicFrameLocks noChangeAspect="1"/>
+            </wp:cNvGraphicFramePr>
+            <a:graphic>
+              <a:graphicData uri="http://schemas.openxmlformats.org/drawingml/2006/picture">
+                <pic:pic>
+                  <pic:nvPicPr>
+                    <pic:cNvPr id="0" name="architecture_diagram.png"/>
+                    <pic:cNvPicPr/>
+                  </pic:nvPicPr>
+                  <pic:blipFill>
+                    <a:blip r:embed="rId9"/>
+                    <a:stretch>
+                      <a:fillRect/>
+                    </a:stretch>
+                  </pic:blipFill>
+                  <pic:spPr>
+                    <a:xfrm>
+                      <a:off x="0" y="0"/>
+                      <a:ext cx="5486400" cy="2743200"/>
+                    </a:xfrm>
+                    <a:prstGeom prst="rect"/>
+                  </pic:spPr>
+                </pic:pic>
+              </a:graphicData>
+            </a:graphic>
+          </wp:inline>
+        </w:drawing>
+      </w:r>
+    </w:p>
+    <w:p>
+      <w:pPr>
+        <w:jc w:val="center"/>
+      </w:pPr>
+      <w:r>
+        <w:rPr>
+          <w:rFonts w:ascii="Arial" w:hAnsi="Arial"/>
+          <w:b w:val="0"/>
+          <w:i/>
+          <w:color w:val="646464"/>
+          <w:sz w:val="19"/>
+        </w:rPr>
+        <w:t>Figure 1: Bizionary ERP Desktop Offline Architecture Map</w:t>
+      </w:r>
+    </w:p>
+    <w:p/>
+    <w:p>
+      <w:r>
+        <w:rPr>
+          <w:rFonts w:ascii="Georgia" w:hAnsi="Georgia"/>
+          <w:b/>
+          <w:i w:val="0"/>
+          <w:color w:val="2B2620"/>
+          <w:sz w:val="32"/>
+        </w:rPr>
+        <w:t>3. Technical Stack Overview</w:t>
       </w:r>
     </w:p>
     <w:p>
@@ -168,7 +237,7 @@
           <w:color w:val="2B2620"/>
           <w:sz w:val="32"/>
         </w:rPr>
-        <w:t>3. Local Server &amp; Request Routing</w:t>
+        <w:t>4. Local Server &amp; Request Routing</w:t>
       </w:r>
     </w:p>
     <w:p>
@@ -190,7 +259,7 @@
           <w:color w:val="2B2620"/>
           <w:sz w:val="32"/>
         </w:rPr>
-        <w:t>4. Launcher &amp; Core Executable Scripts</w:t>
+        <w:t>5. Launcher &amp; Core Executable Scripts</w:t>
       </w:r>
     </w:p>
     <w:p>
@@ -258,7 +327,7 @@
           <w:color w:val="2B2620"/>
           <w:sz w:val="32"/>
         </w:rPr>
-        <w:t>5. Role of the '_internal' Directory</w:t>
+        <w:t>6. Role of the '_internal' Directory</w:t>
       </w:r>
     </w:p>
     <w:p>
@@ -348,7 +417,7 @@
           <w:color w:val="2B2620"/>
           <w:sz w:val="32"/>
         </w:rPr>
-        <w:t>6. Local Database Capacity &amp; Storage Scaling</w:t>
+        <w:t>7. Local Database Capacity &amp; Storage Scaling</w:t>
       </w:r>
     </w:p>
     <w:p>

</xml_diff>